<commit_message>
Complete public MVP data and analytics milestone
Consolidate athlete and event profiles, rankings, event standings, progressive loading, multilingual UI, score governance, mixed-team support, event-level normalization, admin audit workflows, migrations, tests, import reports, and thesis documentation.
</commit_message>
<xml_diff>
--- a/docs/LEVERAGE_capitolo_metodologia_popolamento_db.docx
+++ b/docs/LEVERAGE_capitolo_metodologia_popolamento_db.docx
@@ -2224,6 +2224,12 @@
     <w:p/>
     <w:p>
       <w:r>
+        <w:t>La stima viene considerata utilizzabile solo se il valore calcolato rientra nell'intervallo tecnicamente valido 0-10. Se score - D_score produce un valore negativo o superiore a 10, il problema viene trattato come incoerenza del D_score: il final score resta nel database, mentre il D_score viene portato a NULL / not available per evitare che ranking, medie di difficolta e grafici mostrino una E stimata impossibile.</w:t>
+      </w:r>
+    </w:p>
+    <w:p/>
+    <w:p>
+      <w:r>
         <w:t>Per questo motivo i result con execution stimata sono marcati e devono essere accompagnati da un alert UI del tipo:</w:t>
       </w:r>
     </w:p>
@@ -2325,6 +2331,88 @@
           <w:sz w:val="18"/>
         </w:rPr>
         <w:t>Si noti che Vault 1 puo riferirsi a Vault 2 e viceversa.</w:t>
+      </w:r>
+    </w:p>
+    <w:p/>
+    <w:p>
+      <w:pPr>
+        <w:pStyle w:val="Heading3"/>
+      </w:pPr>
+      <w:r>
+        <w:t>8.6 Upper bound dei final score non-AA e dei D-score</w:t>
+      </w:r>
+    </w:p>
+    <w:p/>
+    <w:p>
+      <w:r>
+        <w:t>Durante il controllo post-import e stato rilevato un caso di VT con final score superiore a 20.0, valore incompatibile con un singolo apparatus. L'analisi ha mostrato che il punteggio impossibile non proveniva direttamente da una classifica finale valida, ma da un valore VT attempt 2 derivato automaticamente da VT AVG usando un VT attempt 1 sorgente digitato in modo errato.</w:t>
+      </w:r>
+    </w:p>
+    <w:p/>
+    <w:p>
+      <w:r>
+        <w:t>La regola adottata e:</w:t>
+      </w:r>
+    </w:p>
+    <w:p/>
+    <w:p>
+      <w:pPr>
+        <w:pStyle w:val="ListBullet"/>
+      </w:pPr>
+      <w:r>
+        <w:t>i result non-AA non possono avere final score superiore a `20.0`;</w:t>
+      </w:r>
+    </w:p>
+    <w:p>
+      <w:pPr>
+        <w:pStyle w:val="ListBullet"/>
+      </w:pPr>
+      <w:r>
+        <w:t>i result `AA` possono superare `20.0`, perche rappresentano un totale multi-apparato;</w:t>
+      </w:r>
+    </w:p>
+    <w:p>
+      <w:pPr>
+        <w:pStyle w:val="ListBullet"/>
+      </w:pPr>
+      <w:r>
+        <w:t>il `D_score` salvato su un result non puo superare `10.0`;</w:t>
+      </w:r>
+    </w:p>
+    <w:p>
+      <w:pPr>
+        <w:pStyle w:val="ListBullet"/>
+      </w:pPr>
+      <w:r>
+        <w:t>per `AA` non viene salvato un `D_score` aggregato sopra `10.0`; la composizione tecnica dell'AA resta ricostruibile dai result dei singoli apparati collegati allo stesso atleta/evento/round/format;</w:t>
+      </w:r>
+    </w:p>
+    <w:p>
+      <w:pPr>
+        <w:pStyle w:val="ListBullet"/>
+      </w:pPr>
+      <w:r>
+        <w:t>se un valore derivato supera il limite, il tool non lo importa e lo segnala in review;</w:t>
+      </w:r>
+    </w:p>
+    <w:p>
+      <w:pPr>
+        <w:pStyle w:val="ListBullet"/>
+      </w:pPr>
+      <w:r>
+        <w:t>se il valore e gia nel database, la correzione avviene tramite script tracciabile, backup e report CSV.</w:t>
+      </w:r>
+    </w:p>
+    <w:p/>
+    <w:p>
+      <w:r>
+        <w:t>Per i D-score storici sopra 10.0, quando non esiste una correzione certa, il campo viene portato a NULL / not available invece di essere stimato. Questa scelta evita di alterare medie di difficolta, ranking per D-score e profili atleta.</w:t>
+      </w:r>
+    </w:p>
+    <w:p/>
+    <w:p>
+      <w:r>
+        <w:t>Queste regole proteggono ranking, grafici e analisi aggregate da outlier non fisiologici, mantenendo pero validi i totali all-around.</w:t>
       </w:r>
     </w:p>
     <w:p/>
@@ -4018,6 +4106,14 @@
         <w:t>possibili variazioni di naming dovute a traslitterazioni, refusi o inversioni nome/cognome.</w:t>
       </w:r>
     </w:p>
+    <w:p>
+      <w:pPr>
+        <w:pStyle w:val="ListBullet"/>
+      </w:pPr>
+      <w:r>
+        <w:t>assenza, nella maggior parte dei casi, della data esatta della singola sessione interna a eventi multigiorno. I file Calendar forniscono il periodo della competizione e i file Results forniscono round/format/apparatus, ma non sempre la data puntuale di qualifiche o finali. LEVERAGE evita quindi di inventare date non presenti nella fonte: nelle analytics i punti vengono ordinati usando l'inizio evento solo come riferimento cronologico, ma sono comunicati all'utente come risultati ottenuti nel periodo dell'evento.</w:t>
+      </w:r>
+    </w:p>
     <w:p/>
     <w:p>
       <w:r>

</xml_diff>